<commit_message>
casb adversary-complaint: the counsel block and the caption back on whole numbered lines in both engines (typst on-grid; the Word filter counts the wrapped single lines with docx/lib/lines.lua, as the casb motion does, and sets the rows to the next numbered line), so the lead-in and page 1's text stand on the line numbers again; XENG-001..003 pass (379/379 lines); check.sh typst 9 passed 0 failed, docx 13 passed 0 failed (fb-595.68.21)
</commit_message>
<xml_diff>
--- a/courts/ninth-circuit/california/federal/bankruptcy-southern-district/adversary-complaint/usage/OUTPUT-adversary-complaint.docx
+++ b/courts/ninth-circuit/california/federal/bankruptcy-southern-district/adversary-complaint/usage/OUTPUT-adversary-complaint.docx
@@ -20,7 +20,7 @@
       <w:tr>
         <w:trPr>
           <w:cantSplit/>
-          <w:trHeight w:val="3360" w:hRule="atLeast"/>
+          <w:trHeight w:val="3840" w:hRule="atLeast"/>
         </w:trPr>
         <w:tc>
           <w:tcPr>
@@ -305,7 +305,7 @@
           </w:p>
           <w:p>
             <w:pPr>
-              <w:spacing w:before="0" w:after="240" w:line="240" w:lineRule="exact"/>
+              <w:spacing w:before="0" w:after="0" w:line="240" w:lineRule="exact"/>
               <w:ind w:left="0" w:firstLine="0"/>
               <w:jc w:val="left"/>
             </w:pPr>
@@ -474,6 +474,10 @@
         <w:gridCol w:w="3744"/>
       </w:tblGrid>
       <w:tr>
+        <w:trPr>
+          <w:cantSplit/>
+          <w:trHeight w:val="4785" w:hRule="atLeast"/>
+        </w:trPr>
         <w:tc>
           <w:tcPr>
             <w:tcW w:w="4608" w:type="dxa"/>

</xml_diff>